<commit_message>
Deploy preview for PR 33 🛫
</commit_message>
<xml_diff>
--- a/pr-preview/pr-33/demo-include-in-header.docx
+++ b/pr-preview/pr-33/demo-include-in-header.docx
@@ -119,9 +119,84 @@
         <w:rPr>
           <w:rStyle w:val="AttributeTok"/>
         </w:rPr>
+        <w:t xml:space="preserve"> macros-header.html</w:t>
+      </w:r>
+      <w:r>
+        <w:rPr>
+          <w:rStyle w:val="CommentTok"/>
+        </w:rPr>
+        <w:t xml:space="preserve">   # HTML file wrapping macros in $$...$$ for MathJax</w:t>
+      </w:r>
+      <w:r>
+        <w:br/>
+      </w:r>
+      <w:r>
+        <w:rPr>
+          <w:rStyle w:val="AttributeTok"/>
+        </w:rPr>
+        <w:t xml:space="preserve">  </w:t>
+      </w:r>
+      <w:r>
+        <w:rPr>
+          <w:rStyle w:val="FunctionTok"/>
+        </w:rPr>
+        <w:t xml:space="preserve">pdf</w:t>
+      </w:r>
+      <w:r>
+        <w:rPr>
+          <w:rStyle w:val="KeywordTok"/>
+        </w:rPr>
+        <w:t xml:space="preserve">:</w:t>
+      </w:r>
+      <w:r>
+        <w:br/>
+      </w:r>
+      <w:r>
+        <w:rPr>
+          <w:rStyle w:val="AttributeTok"/>
+        </w:rPr>
+        <w:t xml:space="preserve">    </w:t>
+      </w:r>
+      <w:r>
+        <w:rPr>
+          <w:rStyle w:val="FunctionTok"/>
+        </w:rPr>
+        <w:t xml:space="preserve">include-in-header</w:t>
+      </w:r>
+      <w:r>
+        <w:rPr>
+          <w:rStyle w:val="KeywordTok"/>
+        </w:rPr>
+        <w:t xml:space="preserve">:</w:t>
+      </w:r>
+      <w:r>
+        <w:br/>
+      </w:r>
+      <w:r>
+        <w:rPr>
+          <w:rStyle w:val="AttributeTok"/>
+        </w:rPr>
+        <w:t xml:space="preserve">      </w:t>
+      </w:r>
+      <w:r>
+        <w:rPr>
+          <w:rStyle w:val="KeywordTok"/>
+        </w:rPr>
+        <w:t xml:space="preserve">-</w:t>
+      </w:r>
+      <w:r>
+        <w:rPr>
+          <w:rStyle w:val="AttributeTok"/>
+        </w:rPr>
         <w:t xml:space="preserve"> macros.qmd</w:t>
       </w:r>
       <w:r>
+        <w:rPr>
+          <w:rStyle w:val="CommentTok"/>
+        </w:rPr>
+        <w:t xml:space="preserve">           # raw LaTeX goes directly into preamble</w:t>
+      </w:r>
+      <w:r>
         <w:br/>
       </w:r>
       <w:r>
@@ -134,7 +209,7 @@
         <w:rPr>
           <w:rStyle w:val="FunctionTok"/>
         </w:rPr>
-        <w:t xml:space="preserve">pdf</w:t>
+        <w:t xml:space="preserve">revealjs</w:t>
       </w:r>
       <w:r>
         <w:rPr>
@@ -155,6 +230,33 @@
         <w:rPr>
           <w:rStyle w:val="FunctionTok"/>
         </w:rPr>
+        <w:t xml:space="preserve">output-file</w:t>
+      </w:r>
+      <w:r>
+        <w:rPr>
+          <w:rStyle w:val="KeywordTok"/>
+        </w:rPr>
+        <w:t xml:space="preserve">:</w:t>
+      </w:r>
+      <w:r>
+        <w:rPr>
+          <w:rStyle w:val="AttributeTok"/>
+        </w:rPr>
+        <w:t xml:space="preserve"> demo-include-in-header-slides.html</w:t>
+      </w:r>
+      <w:r>
+        <w:br/>
+      </w:r>
+      <w:r>
+        <w:rPr>
+          <w:rStyle w:val="AttributeTok"/>
+        </w:rPr>
+        <w:t xml:space="preserve">    </w:t>
+      </w:r>
+      <w:r>
+        <w:rPr>
+          <w:rStyle w:val="FunctionTok"/>
+        </w:rPr>
         <w:t xml:space="preserve">include-in-header</w:t>
       </w:r>
       <w:r>
@@ -182,7 +284,13 @@
         <w:rPr>
           <w:rStyle w:val="AttributeTok"/>
         </w:rPr>
-        <w:t xml:space="preserve"> macros.qmd</w:t>
+        <w:t xml:space="preserve"> macros-header.html</w:t>
+      </w:r>
+      <w:r>
+        <w:rPr>
+          <w:rStyle w:val="CommentTok"/>
+        </w:rPr>
+        <w:t xml:space="preserve">   # same as HTML</w:t>
       </w:r>
       <w:r>
         <w:br/>
@@ -221,22 +329,13 @@
           <w:b/>
           <w:bCs/>
         </w:rPr>
-        <w:t xml:space="preserve">Note:</w:t>
-      </w:r>
-      <w:r>
-        <w:t xml:space="preserve"> </w:t>
-      </w:r>
-      <w:r>
-        <w:rPr>
-          <w:rStyle w:val="VerbatimChar"/>
-        </w:rPr>
-        <w:t xml:space="preserve">revealjs</w:t>
-      </w:r>
-      <w:r>
-        <w:t xml:space="preserve"> </w:t>
-      </w:r>
-      <w:r>
-        <w:t xml:space="preserve">is omitted from this demo page because a Quarto website page cannot simultaneously be a RevealJS presentation. To use</w:t>
+        <w:t xml:space="preserve">Note (HTML/RevealJS):</w:t>
+      </w:r>
+      <w:r>
+        <w:t xml:space="preserve"> </w:t>
+      </w:r>
+      <w:r>
+        <w:t xml:space="preserve">For HTML and RevealJS output,</w:t>
       </w:r>
       <w:r>
         <w:t xml:space="preserve"> </w:t>
@@ -251,52 +350,79 @@
         <w:t xml:space="preserve"> </w:t>
       </w:r>
       <w:r>
-        <w:t xml:space="preserve">with RevealJS, add a</w:t>
-      </w:r>
-      <w:r>
-        <w:t xml:space="preserve"> </w:t>
-      </w:r>
-      <w:r>
-        <w:rPr>
-          <w:rStyle w:val="VerbatimChar"/>
-        </w:rPr>
-        <w:t xml:space="preserve">revealjs:</w:t>
-      </w:r>
-      <w:r>
-        <w:t xml:space="preserve"> </w:t>
-      </w:r>
-      <w:r>
-        <w:t xml:space="preserve">entry in a standalone</w:t>
-      </w:r>
-      <w:r>
-        <w:t xml:space="preserve"> </w:t>
-      </w:r>
-      <w:r>
-        <w:rPr>
-          <w:rStyle w:val="VerbatimChar"/>
-        </w:rPr>
-        <w:t xml:space="preserve">.qmd</w:t>
-      </w:r>
-      <w:r>
-        <w:t xml:space="preserve"> </w:t>
-      </w:r>
-      <w:r>
-        <w:t xml:space="preserve">file or in</w:t>
-      </w:r>
-      <w:r>
-        <w:t xml:space="preserve"> </w:t>
-      </w:r>
-      <w:r>
-        <w:rPr>
-          <w:rStyle w:val="VerbatimChar"/>
-        </w:rPr>
-        <w:t xml:space="preserve">_quarto.yml</w:t>
-      </w:r>
-      <w:r>
-        <w:t xml:space="preserve"> </w:t>
-      </w:r>
-      <w:r>
-        <w:t xml:space="preserve">(see the project-wide config below).</w:t>
+        <w:t xml:space="preserve">inserts content verbatim into the page. To load macros, the included file must wrap the definitions in</w:t>
+      </w:r>
+      <w:r>
+        <w:t xml:space="preserve"> </w:t>
+      </w:r>
+      <w:r>
+        <w:rPr>
+          <w:rStyle w:val="VerbatimChar"/>
+        </w:rPr>
+        <w:t xml:space="preserve">$$...$$</w:t>
+      </w:r>
+      <w:r>
+        <w:t xml:space="preserve"> </w:t>
+      </w:r>
+      <w:r>
+        <w:t xml:space="preserve">inside a hidden element so MathJax processes them. The file</w:t>
+      </w:r>
+      <w:r>
+        <w:t xml:space="preserve"> </w:t>
+      </w:r>
+      <w:r>
+        <w:rPr>
+          <w:rStyle w:val="VerbatimChar"/>
+        </w:rPr>
+        <w:t xml:space="preserve">macros-header.html</w:t>
+      </w:r>
+      <w:r>
+        <w:t xml:space="preserve"> </w:t>
+      </w:r>
+      <w:r>
+        <w:t xml:space="preserve">in this repository does exactly that — it wraps the content of</w:t>
+      </w:r>
+      <w:r>
+        <w:t xml:space="preserve"> </w:t>
+      </w:r>
+      <w:r>
+        <w:rPr>
+          <w:rStyle w:val="VerbatimChar"/>
+        </w:rPr>
+        <w:t xml:space="preserve">macros.qmd</w:t>
+      </w:r>
+      <w:r>
+        <w:t xml:space="preserve"> </w:t>
+      </w:r>
+      <w:r>
+        <w:t xml:space="preserve">in</w:t>
+      </w:r>
+      <w:r>
+        <w:t xml:space="preserve"> </w:t>
+      </w:r>
+      <w:r>
+        <w:rPr>
+          <w:rStyle w:val="VerbatimChar"/>
+        </w:rPr>
+        <w:t xml:space="preserve">&lt;div style="display:none"&gt;$$...$$&lt;/div&gt;</w:t>
+      </w:r>
+      <w:r>
+        <w:t xml:space="preserve">. For PDF,</w:t>
+      </w:r>
+      <w:r>
+        <w:t xml:space="preserve"> </w:t>
+      </w:r>
+      <w:r>
+        <w:rPr>
+          <w:rStyle w:val="VerbatimChar"/>
+        </w:rPr>
+        <w:t xml:space="preserve">macros.qmd</w:t>
+      </w:r>
+      <w:r>
+        <w:t xml:space="preserve"> </w:t>
+      </w:r>
+      <w:r>
+        <w:t xml:space="preserve">can be included directly since its raw LaTeX goes into the document preamble.</w:t>
       </w:r>
     </w:p>
     <w:p>
@@ -308,337 +434,406 @@
           <w:b/>
           <w:bCs/>
         </w:rPr>
-        <w:t xml:space="preserve">Note:</w:t>
-      </w:r>
-      <w:r>
-        <w:t xml:space="preserve"> </w:t>
-      </w:r>
-      <w:r>
-        <w:t xml:space="preserve">This demo uses</w:t>
-      </w:r>
-      <w:r>
-        <w:t xml:space="preserve"> </w:t>
-      </w:r>
-      <w:r>
-        <w:rPr>
-          <w:rStyle w:val="VerbatimChar"/>
-        </w:rPr>
-        <w:t xml:space="preserve">macros.qmd</w:t>
-      </w:r>
-      <w:r>
-        <w:t xml:space="preserve"> </w:t>
-      </w:r>
-      <w:r>
-        <w:t xml:space="preserve">because</w:t>
-      </w:r>
-      <w:r>
-        <w:t xml:space="preserve"> </w:t>
-      </w:r>
-      <w:r>
-        <w:rPr>
-          <w:rStyle w:val="VerbatimChar"/>
-        </w:rPr>
-        <w:t xml:space="preserve">macros.qmd</w:t>
-      </w:r>
-      <w:r>
-        <w:t xml:space="preserve"> </w:t>
-      </w:r>
-      <w:r>
-        <w:t xml:space="preserve">is at the root of this repository. When using this repository as a Git submodule (cloned into a</w:t>
-      </w:r>
-      <w:r>
-        <w:t xml:space="preserve"> </w:t>
-      </w:r>
-      <w:r>
-        <w:rPr>
-          <w:rStyle w:val="VerbatimChar"/>
-        </w:rPr>
-        <w:t xml:space="preserve">macros/</w:t>
-      </w:r>
-      <w:r>
-        <w:t xml:space="preserve"> </w:t>
-      </w:r>
-      <w:r>
-        <w:t xml:space="preserve">subdirectory), replace</w:t>
-      </w:r>
-      <w:r>
-        <w:t xml:space="preserve"> </w:t>
-      </w:r>
-      <w:r>
-        <w:rPr>
-          <w:rStyle w:val="VerbatimChar"/>
-        </w:rPr>
-        <w:t xml:space="preserve">macros.qmd</w:t>
-      </w:r>
-      <w:r>
-        <w:t xml:space="preserve"> </w:t>
-      </w:r>
-      <w:r>
-        <w:t xml:space="preserve">with</w:t>
-      </w:r>
-      <w:r>
-        <w:t xml:space="preserve"> </w:t>
-      </w:r>
-      <w:r>
-        <w:rPr>
-          <w:rStyle w:val="VerbatimChar"/>
-        </w:rPr>
-        <w:t xml:space="preserve">macros/macros.qmd</w:t>
-      </w:r>
+        <w:t xml:space="preserve">Note (revealjs</w:t>
+      </w:r>
+      <w:r>
+        <w:rPr>
+          <w:b/>
+          <w:bCs/>
+        </w:rPr>
+        <w:t xml:space="preserve"> </w:t>
+      </w:r>
+      <w:r>
+        <w:rPr>
+          <w:rStyle w:val="VerbatimChar"/>
+          <w:b/>
+          <w:bCs/>
+        </w:rPr>
+        <w:t xml:space="preserve">output-file</w:t>
+      </w:r>
+      <w:r>
+        <w:rPr>
+          <w:b/>
+          <w:bCs/>
+        </w:rPr>
+        <w:t xml:space="preserve">):</w:t>
+      </w:r>
+      <w:r>
+        <w:t xml:space="preserve"> </w:t>
+      </w:r>
+      <w:r>
+        <w:t xml:space="preserve">RevealJS and HTML formats both produce</w:t>
+      </w:r>
+      <w:r>
+        <w:t xml:space="preserve"> </w:t>
+      </w:r>
+      <w:r>
+        <w:rPr>
+          <w:rStyle w:val="VerbatimChar"/>
+        </w:rPr>
+        <w:t xml:space="preserve">.html</w:t>
+      </w:r>
+      <w:r>
+        <w:t xml:space="preserve"> </w:t>
+      </w:r>
+      <w:r>
+        <w:t xml:space="preserve">output by default. When both are listed in a Quarto website document,</w:t>
+      </w:r>
+      <w:r>
+        <w:t xml:space="preserve"> </w:t>
+      </w:r>
+      <w:r>
+        <w:rPr>
+          <w:rStyle w:val="VerbatimChar"/>
+        </w:rPr>
+        <w:t xml:space="preserve">output-file</w:t>
+      </w:r>
+      <w:r>
+        <w:t xml:space="preserve"> </w:t>
+      </w:r>
+      <w:r>
+        <w:t xml:space="preserve">gives the RevealJS output a distinct filename so there is no conflict.</w:t>
+      </w:r>
+      <w:r>
+        <w:t xml:space="preserve"> </w:t>
+      </w:r>
+      <w:hyperlink r:id="rId9">
+        <w:r>
+          <w:rPr>
+            <w:rStyle w:val="Hyperlink"/>
+          </w:rPr>
+          <w:t xml:space="preserve">View the RevealJS slides output</w:t>
+        </w:r>
+      </w:hyperlink>
       <w:r>
         <w:t xml:space="preserve">.</w:t>
       </w:r>
     </w:p>
     <w:p>
       <w:pPr>
-        <w:pStyle w:val="FirstParagraph"/>
-      </w:pPr>
-      <w:r>
-        <w:t xml:space="preserve">The same configuration can be placed in a shared</w:t>
-      </w:r>
-      <w:r>
-        <w:t xml:space="preserve"> </w:t>
-      </w:r>
-      <w:r>
-        <w:rPr>
-          <w:rStyle w:val="VerbatimChar"/>
-        </w:rPr>
-        <w:t xml:space="preserve">_quarto.yml</w:t>
-      </w:r>
-      <w:r>
-        <w:t xml:space="preserve"> </w:t>
-      </w:r>
-      <w:r>
-        <w:t xml:space="preserve">to apply project-wide:</w:t>
+        <w:pStyle w:val="BlockText"/>
+      </w:pPr>
+      <w:r>
+        <w:rPr>
+          <w:b/>
+          <w:bCs/>
+        </w:rPr>
+        <w:t xml:space="preserve">Note:</w:t>
+      </w:r>
+      <w:r>
+        <w:t xml:space="preserve"> </w:t>
+      </w:r>
+      <w:r>
+        <w:t xml:space="preserve">This demo uses</w:t>
+      </w:r>
+      <w:r>
+        <w:t xml:space="preserve"> </w:t>
+      </w:r>
+      <w:r>
+        <w:rPr>
+          <w:rStyle w:val="VerbatimChar"/>
+        </w:rPr>
+        <w:t xml:space="preserve">macros-header.html</w:t>
+      </w:r>
+      <w:r>
+        <w:t xml:space="preserve"> </w:t>
+      </w:r>
+      <w:r>
+        <w:t xml:space="preserve">/</w:t>
+      </w:r>
+      <w:r>
+        <w:t xml:space="preserve"> </w:t>
+      </w:r>
+      <w:r>
+        <w:rPr>
+          <w:rStyle w:val="VerbatimChar"/>
+        </w:rPr>
+        <w:t xml:space="preserve">macros.qmd</w:t>
+      </w:r>
+      <w:r>
+        <w:t xml:space="preserve"> </w:t>
+      </w:r>
+      <w:r>
+        <w:t xml:space="preserve">because both files are at the root of this repository. When using this repository as a Git submodule (cloned into a</w:t>
+      </w:r>
+      <w:r>
+        <w:t xml:space="preserve"> </w:t>
+      </w:r>
+      <w:r>
+        <w:rPr>
+          <w:rStyle w:val="VerbatimChar"/>
+        </w:rPr>
+        <w:t xml:space="preserve">macros/</w:t>
+      </w:r>
+      <w:r>
+        <w:t xml:space="preserve"> </w:t>
+      </w:r>
+      <w:r>
+        <w:t xml:space="preserve">subdirectory), replace with</w:t>
+      </w:r>
+      <w:r>
+        <w:t xml:space="preserve"> </w:t>
+      </w:r>
+      <w:r>
+        <w:rPr>
+          <w:rStyle w:val="VerbatimChar"/>
+        </w:rPr>
+        <w:t xml:space="preserve">macros/macros-header.html</w:t>
+      </w:r>
+      <w:r>
+        <w:t xml:space="preserve"> </w:t>
+      </w:r>
+      <w:r>
+        <w:t xml:space="preserve">and</w:t>
+      </w:r>
+      <w:r>
+        <w:t xml:space="preserve"> </w:t>
+      </w:r>
+      <w:r>
+        <w:rPr>
+          <w:rStyle w:val="VerbatimChar"/>
+        </w:rPr>
+        <w:t xml:space="preserve">macros/macros.qmd</w:t>
+      </w:r>
+      <w:r>
+        <w:t xml:space="preserve">.</w:t>
       </w:r>
     </w:p>
     <w:p>
       <w:pPr>
-        <w:pStyle w:val="SourceCode"/>
-      </w:pPr>
-      <w:r>
-        <w:rPr>
-          <w:rStyle w:val="FunctionTok"/>
-        </w:rPr>
-        <w:t xml:space="preserve">format</w:t>
-      </w:r>
-      <w:r>
-        <w:rPr>
-          <w:rStyle w:val="KeywordTok"/>
-        </w:rPr>
-        <w:t xml:space="preserve">:</w:t>
-      </w:r>
-      <w:r>
-        <w:br/>
-      </w:r>
-      <w:r>
-        <w:rPr>
-          <w:rStyle w:val="AttributeTok"/>
-        </w:rPr>
-        <w:t xml:space="preserve">  </w:t>
-      </w:r>
-      <w:r>
-        <w:rPr>
-          <w:rStyle w:val="FunctionTok"/>
-        </w:rPr>
-        <w:t xml:space="preserve">html</w:t>
-      </w:r>
-      <w:r>
-        <w:rPr>
-          <w:rStyle w:val="KeywordTok"/>
-        </w:rPr>
-        <w:t xml:space="preserve">:</w:t>
-      </w:r>
-      <w:r>
-        <w:br/>
-      </w:r>
-      <w:r>
-        <w:rPr>
-          <w:rStyle w:val="AttributeTok"/>
-        </w:rPr>
-        <w:t xml:space="preserve">    </w:t>
-      </w:r>
-      <w:r>
-        <w:rPr>
-          <w:rStyle w:val="FunctionTok"/>
-        </w:rPr>
-        <w:t xml:space="preserve">include-in-header</w:t>
-      </w:r>
-      <w:r>
-        <w:rPr>
-          <w:rStyle w:val="KeywordTok"/>
-        </w:rPr>
-        <w:t xml:space="preserve">:</w:t>
-      </w:r>
-      <w:r>
-        <w:br/>
-      </w:r>
-      <w:r>
-        <w:rPr>
-          <w:rStyle w:val="AttributeTok"/>
-        </w:rPr>
-        <w:t xml:space="preserve">      </w:t>
-      </w:r>
-      <w:r>
-        <w:rPr>
-          <w:rStyle w:val="KeywordTok"/>
-        </w:rPr>
-        <w:t xml:space="preserve">-</w:t>
-      </w:r>
-      <w:r>
-        <w:rPr>
-          <w:rStyle w:val="AttributeTok"/>
-        </w:rPr>
-        <w:t xml:space="preserve"> macros/macros.qmd</w:t>
-      </w:r>
-      <w:r>
-        <w:br/>
-      </w:r>
-      <w:r>
-        <w:rPr>
-          <w:rStyle w:val="AttributeTok"/>
-        </w:rPr>
-        <w:t xml:space="preserve">  </w:t>
-      </w:r>
-      <w:r>
-        <w:rPr>
-          <w:rStyle w:val="FunctionTok"/>
-        </w:rPr>
-        <w:t xml:space="preserve">pdf</w:t>
-      </w:r>
-      <w:r>
-        <w:rPr>
-          <w:rStyle w:val="KeywordTok"/>
-        </w:rPr>
-        <w:t xml:space="preserve">:</w:t>
-      </w:r>
-      <w:r>
-        <w:br/>
-      </w:r>
-      <w:r>
-        <w:rPr>
-          <w:rStyle w:val="AttributeTok"/>
-        </w:rPr>
-        <w:t xml:space="preserve">    </w:t>
-      </w:r>
-      <w:r>
-        <w:rPr>
-          <w:rStyle w:val="FunctionTok"/>
-        </w:rPr>
-        <w:t xml:space="preserve">include-in-header</w:t>
-      </w:r>
-      <w:r>
-        <w:rPr>
-          <w:rStyle w:val="KeywordTok"/>
-        </w:rPr>
-        <w:t xml:space="preserve">:</w:t>
-      </w:r>
-      <w:r>
-        <w:br/>
-      </w:r>
-      <w:r>
-        <w:rPr>
-          <w:rStyle w:val="AttributeTok"/>
-        </w:rPr>
-        <w:t xml:space="preserve">      </w:t>
-      </w:r>
-      <w:r>
-        <w:rPr>
-          <w:rStyle w:val="KeywordTok"/>
-        </w:rPr>
-        <w:t xml:space="preserve">-</w:t>
-      </w:r>
-      <w:r>
-        <w:rPr>
-          <w:rStyle w:val="AttributeTok"/>
-        </w:rPr>
-        <w:t xml:space="preserve"> macros/macros.qmd</w:t>
-      </w:r>
-      <w:r>
-        <w:br/>
-      </w:r>
-      <w:r>
-        <w:rPr>
-          <w:rStyle w:val="AttributeTok"/>
-        </w:rPr>
-        <w:t xml:space="preserve">  </w:t>
-      </w:r>
-      <w:r>
-        <w:rPr>
-          <w:rStyle w:val="FunctionTok"/>
-        </w:rPr>
-        <w:t xml:space="preserve">revealjs</w:t>
-      </w:r>
-      <w:r>
-        <w:rPr>
-          <w:rStyle w:val="KeywordTok"/>
-        </w:rPr>
-        <w:t xml:space="preserve">:</w:t>
-      </w:r>
-      <w:r>
-        <w:br/>
-      </w:r>
-      <w:r>
-        <w:rPr>
-          <w:rStyle w:val="AttributeTok"/>
-        </w:rPr>
-        <w:t xml:space="preserve">    </w:t>
-      </w:r>
-      <w:r>
-        <w:rPr>
-          <w:rStyle w:val="FunctionTok"/>
-        </w:rPr>
-        <w:t xml:space="preserve">include-in-header</w:t>
-      </w:r>
-      <w:r>
-        <w:rPr>
-          <w:rStyle w:val="KeywordTok"/>
-        </w:rPr>
-        <w:t xml:space="preserve">:</w:t>
-      </w:r>
-      <w:r>
-        <w:br/>
-      </w:r>
-      <w:r>
-        <w:rPr>
-          <w:rStyle w:val="AttributeTok"/>
-        </w:rPr>
-        <w:t xml:space="preserve">      </w:t>
-      </w:r>
-      <w:r>
-        <w:rPr>
-          <w:rStyle w:val="KeywordTok"/>
-        </w:rPr>
-        <w:t xml:space="preserve">-</w:t>
-      </w:r>
-      <w:r>
-        <w:rPr>
-          <w:rStyle w:val="AttributeTok"/>
-        </w:rPr>
-        <w:t xml:space="preserve"> macros/macros.qmd</w:t>
+        <w:pStyle w:val="FirstParagraph"/>
+      </w:pPr>
+      <w:r>
+        <w:t xml:space="preserve">The same configuration can be placed in a shared</w:t>
+      </w:r>
+      <w:r>
+        <w:t xml:space="preserve"> </w:t>
+      </w:r>
+      <w:r>
+        <w:rPr>
+          <w:rStyle w:val="VerbatimChar"/>
+        </w:rPr>
+        <w:t xml:space="preserve">_quarto.yml</w:t>
+      </w:r>
+      <w:r>
+        <w:t xml:space="preserve"> </w:t>
+      </w:r>
+      <w:r>
+        <w:t xml:space="preserve">to apply project-wide:</w:t>
       </w:r>
     </w:p>
     <w:p>
       <w:pPr>
+        <w:pStyle w:val="SourceCode"/>
+      </w:pPr>
+      <w:r>
+        <w:rPr>
+          <w:rStyle w:val="FunctionTok"/>
+        </w:rPr>
+        <w:t xml:space="preserve">format</w:t>
+      </w:r>
+      <w:r>
+        <w:rPr>
+          <w:rStyle w:val="KeywordTok"/>
+        </w:rPr>
+        <w:t xml:space="preserve">:</w:t>
+      </w:r>
+      <w:r>
+        <w:br/>
+      </w:r>
+      <w:r>
+        <w:rPr>
+          <w:rStyle w:val="AttributeTok"/>
+        </w:rPr>
+        <w:t xml:space="preserve">  </w:t>
+      </w:r>
+      <w:r>
+        <w:rPr>
+          <w:rStyle w:val="FunctionTok"/>
+        </w:rPr>
+        <w:t xml:space="preserve">html</w:t>
+      </w:r>
+      <w:r>
+        <w:rPr>
+          <w:rStyle w:val="KeywordTok"/>
+        </w:rPr>
+        <w:t xml:space="preserve">:</w:t>
+      </w:r>
+      <w:r>
+        <w:br/>
+      </w:r>
+      <w:r>
+        <w:rPr>
+          <w:rStyle w:val="AttributeTok"/>
+        </w:rPr>
+        <w:t xml:space="preserve">    </w:t>
+      </w:r>
+      <w:r>
+        <w:rPr>
+          <w:rStyle w:val="FunctionTok"/>
+        </w:rPr>
+        <w:t xml:space="preserve">include-in-header</w:t>
+      </w:r>
+      <w:r>
+        <w:rPr>
+          <w:rStyle w:val="KeywordTok"/>
+        </w:rPr>
+        <w:t xml:space="preserve">:</w:t>
+      </w:r>
+      <w:r>
+        <w:br/>
+      </w:r>
+      <w:r>
+        <w:rPr>
+          <w:rStyle w:val="AttributeTok"/>
+        </w:rPr>
+        <w:t xml:space="preserve">      </w:t>
+      </w:r>
+      <w:r>
+        <w:rPr>
+          <w:rStyle w:val="KeywordTok"/>
+        </w:rPr>
+        <w:t xml:space="preserve">-</w:t>
+      </w:r>
+      <w:r>
+        <w:rPr>
+          <w:rStyle w:val="AttributeTok"/>
+        </w:rPr>
+        <w:t xml:space="preserve"> macros/macros-header.html</w:t>
+      </w:r>
+      <w:r>
+        <w:br/>
+      </w:r>
+      <w:r>
+        <w:rPr>
+          <w:rStyle w:val="AttributeTok"/>
+        </w:rPr>
+        <w:t xml:space="preserve">  </w:t>
+      </w:r>
+      <w:r>
+        <w:rPr>
+          <w:rStyle w:val="FunctionTok"/>
+        </w:rPr>
+        <w:t xml:space="preserve">pdf</w:t>
+      </w:r>
+      <w:r>
+        <w:rPr>
+          <w:rStyle w:val="KeywordTok"/>
+        </w:rPr>
+        <w:t xml:space="preserve">:</w:t>
+      </w:r>
+      <w:r>
+        <w:br/>
+      </w:r>
+      <w:r>
+        <w:rPr>
+          <w:rStyle w:val="AttributeTok"/>
+        </w:rPr>
+        <w:t xml:space="preserve">    </w:t>
+      </w:r>
+      <w:r>
+        <w:rPr>
+          <w:rStyle w:val="FunctionTok"/>
+        </w:rPr>
+        <w:t xml:space="preserve">include-in-header</w:t>
+      </w:r>
+      <w:r>
+        <w:rPr>
+          <w:rStyle w:val="KeywordTok"/>
+        </w:rPr>
+        <w:t xml:space="preserve">:</w:t>
+      </w:r>
+      <w:r>
+        <w:br/>
+      </w:r>
+      <w:r>
+        <w:rPr>
+          <w:rStyle w:val="AttributeTok"/>
+        </w:rPr>
+        <w:t xml:space="preserve">      </w:t>
+      </w:r>
+      <w:r>
+        <w:rPr>
+          <w:rStyle w:val="KeywordTok"/>
+        </w:rPr>
+        <w:t xml:space="preserve">-</w:t>
+      </w:r>
+      <w:r>
+        <w:rPr>
+          <w:rStyle w:val="AttributeTok"/>
+        </w:rPr>
+        <w:t xml:space="preserve"> macros/macros.qmd</w:t>
+      </w:r>
+      <w:r>
+        <w:br/>
+      </w:r>
+      <w:r>
+        <w:rPr>
+          <w:rStyle w:val="AttributeTok"/>
+        </w:rPr>
+        <w:t xml:space="preserve">  </w:t>
+      </w:r>
+      <w:r>
+        <w:rPr>
+          <w:rStyle w:val="FunctionTok"/>
+        </w:rPr>
+        <w:t xml:space="preserve">revealjs</w:t>
+      </w:r>
+      <w:r>
+        <w:rPr>
+          <w:rStyle w:val="KeywordTok"/>
+        </w:rPr>
+        <w:t xml:space="preserve">:</w:t>
+      </w:r>
+      <w:r>
+        <w:br/>
+      </w:r>
+      <w:r>
+        <w:rPr>
+          <w:rStyle w:val="AttributeTok"/>
+        </w:rPr>
+        <w:t xml:space="preserve">    </w:t>
+      </w:r>
+      <w:r>
+        <w:rPr>
+          <w:rStyle w:val="FunctionTok"/>
+        </w:rPr>
+        <w:t xml:space="preserve">include-in-header</w:t>
+      </w:r>
+      <w:r>
+        <w:rPr>
+          <w:rStyle w:val="KeywordTok"/>
+        </w:rPr>
+        <w:t xml:space="preserve">:</w:t>
+      </w:r>
+      <w:r>
+        <w:br/>
+      </w:r>
+      <w:r>
+        <w:rPr>
+          <w:rStyle w:val="AttributeTok"/>
+        </w:rPr>
+        <w:t xml:space="preserve">      </w:t>
+      </w:r>
+      <w:r>
+        <w:rPr>
+          <w:rStyle w:val="KeywordTok"/>
+        </w:rPr>
+        <w:t xml:space="preserve">-</w:t>
+      </w:r>
+      <w:r>
+        <w:rPr>
+          <w:rStyle w:val="AttributeTok"/>
+        </w:rPr>
+        <w:t xml:space="preserve"> macros/macros-header.html</w:t>
+      </w:r>
+    </w:p>
+    <w:p>
+      <w:pPr>
         <w:pStyle w:val="FirstParagraph"/>
       </w:pPr>
       <w:r>
-        <w:t xml:space="preserve">This inserts</w:t>
-      </w:r>
-      <w:r>
-        <w:t xml:space="preserve"> </w:t>
-      </w:r>
-      <w:r>
-        <w:rPr>
-          <w:rStyle w:val="VerbatimChar"/>
-        </w:rPr>
-        <w:t xml:space="preserve">macros.qmd</w:t>
-      </w:r>
-      <w:r>
-        <w:t xml:space="preserve"> </w:t>
-      </w:r>
-      <w:r>
-        <w:t xml:space="preserve">verbatim into the document header for each output format:</w:t>
+        <w:t xml:space="preserve">This inserts the macro definitions into the document header for each output format:</w:t>
       </w:r>
     </w:p>
     <w:p>
@@ -657,7 +852,22 @@
         <w:t xml:space="preserve">PDF</w:t>
       </w:r>
       <w:r>
-        <w:t xml:space="preserve">: definitions go into the LaTeX preamble — all macros work, including</w:t>
+        <w:t xml:space="preserve">:</w:t>
+      </w:r>
+      <w:r>
+        <w:t xml:space="preserve"> </w:t>
+      </w:r>
+      <w:r>
+        <w:rPr>
+          <w:rStyle w:val="VerbatimChar"/>
+        </w:rPr>
+        <w:t xml:space="preserve">macros.qmd</w:t>
+      </w:r>
+      <w:r>
+        <w:t xml:space="preserve"> </w:t>
+      </w:r>
+      <w:r>
+        <w:t xml:space="preserve">goes into the LaTeX preamble — all macros work, including</w:t>
       </w:r>
       <w:r>
         <w:t xml:space="preserve"> </w:t>
@@ -688,7 +898,37 @@
         <w:t xml:space="preserve">HTML/RevealJS</w:t>
       </w:r>
       <w:r>
-        <w:t xml:space="preserve">: MathJax processes the header — MathJax-supported commands (</w:t>
+        <w:t xml:space="preserve">:</w:t>
+      </w:r>
+      <w:r>
+        <w:t xml:space="preserve"> </w:t>
+      </w:r>
+      <w:r>
+        <w:rPr>
+          <w:rStyle w:val="VerbatimChar"/>
+        </w:rPr>
+        <w:t xml:space="preserve">macros-header.html</w:t>
+      </w:r>
+      <w:r>
+        <w:t xml:space="preserve"> </w:t>
+      </w:r>
+      <w:r>
+        <w:t xml:space="preserve">wraps the definitions in</w:t>
+      </w:r>
+      <w:r>
+        <w:t xml:space="preserve"> </w:t>
+      </w:r>
+      <w:r>
+        <w:rPr>
+          <w:rStyle w:val="VerbatimChar"/>
+        </w:rPr>
+        <w:t xml:space="preserve">$$...$$</w:t>
+      </w:r>
+      <w:r>
+        <w:t xml:space="preserve"> </w:t>
+      </w:r>
+      <w:r>
+        <w:t xml:space="preserve">so MathJax processes them — MathJax-supported commands (</w:t>
       </w:r>
       <w:r>
         <w:rPr>
@@ -812,7 +1052,7 @@
         <w:t xml:space="preserve">entry above produces docx output without macro support.</w:t>
       </w:r>
     </w:p>
-    <w:bookmarkStart w:id="9" w:name="example-math"/>
+    <w:bookmarkStart w:id="10" w:name="example-math"/>
     <w:p>
       <w:pPr>
         <w:pStyle w:val="Heading2"/>
@@ -1287,7 +1527,7 @@
         </w:tc>
       </w:tr>
     </w:tbl>
-    <w:bookmarkEnd w:id="9"/>
+    <w:bookmarkEnd w:id="10"/>
     <w:sectPr>
       <w:footnotePr>
         <w:numRestart w:val="eachSect"/>

</xml_diff>